<commit_message>
jsr: order APA multi-citations alphabetically and merge same-author years
Co-Authored-By: Tatsuki Onishi <bougtoir@gmail.com>
</commit_message>
<xml_diff>
--- a/output/manuscript/heat_crash_mortality_jsr.docx
+++ b/output/manuscript/heat_crash_mortality_jsr.docx
@@ -125,14 +125,14 @@
       </w:r>
       <w:r>
         <w:rPr/>
-        <w:t xml:space="preserve"> (Gasparrini et al., 2015; Basu, 2009).</w:t>
+        <w:t xml:space="preserve"> (Basu, 2009; Gasparrini et al., 2015).</w:t>
       </w:r>
       <w:r>
         <w:t xml:space="preserve"> Recent syntheses also link higher ambient temperature to increased road traffic accidents and injuries</w:t>
       </w:r>
       <w:r>
         <w:rPr/>
-        <w:t xml:space="preserve"> (Liang et al., 2022; Liang et al., 2021).</w:t>
+        <w:t xml:space="preserve"> (Liang et al., 2021, 2022).</w:t>
       </w:r>
       <w:r>
         <w:t xml:space="preserve"> Occupational and driving activity do not stop during heat, so some fatal accidents plausibly involve heat-related impairment or overt heat illness. Traffic-crash deaths are of particular interest because decedents rarely undergo the post-mortem assessment that would identify a heat contribution, so any such contribution would be largely invisible in routine cause-of-death coding. We therefore ask whether days that are hotter than the local seasonal norm carry excess traffic-crash mortality, and how the magnitude compares with officially recorded direct-heat deaths. This is an ecological, population-level study whose aim is to gauge the potential societal burden of under-recognised heat illness—the deaths that would be missing from official heat statistics—rather than to diagnose heat illness in any individual crash. If population-level heat contributes to road deaths, heat-aware road safety messaging and occupational protections for outdoor riders and drivers could reduce a burden currently invisible to both heat-mortality and road-safety surveillance.</w:t>
@@ -2569,7 +2569,7 @@
       </w:r>
       <w:r>
         <w:rPr/>
-        <w:t xml:space="preserve"> (Liang et al., 2022; Liang et al., 2021).</w:t>
+        <w:t xml:space="preserve"> (Liang et al., 2021, 2022).</w:t>
       </w:r>
     </w:p>
     <w:p>

</xml_diff>

<commit_message>
Soften causal phrasing in Discussion and Practical Applications
Co-Authored-By: Tatsuki Onishi <bougtoir@gmail.com>
</commit_message>
<xml_diff>
--- a/output/manuscript/heat_crash_mortality_jsr.docx
+++ b/output/manuscript/heat_crash_mortality_jsr.docx
@@ -3262,7 +3262,7 @@
         <w:spacing w:after="120" w:line="480" w:lineRule="auto"/>
       </w:pPr>
       <w:r>
-        <w:t>Two features of the data argue against confounding by overall driving volume and are consistent with a direct heat effect. The excess rose with direct heat exposure: it was small for enclosed, often air-conditioned vehicle occupants but several-fold larger for motorcyclists, pedestrians and cyclists, who are directly exposed and often physically exerting. It was also largest in the hottest hours of the day. Both patterns are consistent with heat degrading psychomotor and cognitive performance. The crash-circumstance strata point the same way: the excess was larger for single-vehicle crashes than for multi-vehicle collisions, persisted on clear days, and was similar whether or not a driver was reported to have been drinking. The Japanese strata, although very imprecise, point the same way: the single-vehicle estimate was again the largest and the vehicle-pedestrian point estimate fell below one, the ordering expected if hot days both degrade vehicle control and reduce pedestrian exposure.These gradients are not proof of mechanism, however: open-air travel is itself weather-sensitive, so more motorcycling, cycling and walking on hotter-than-normal days could inflate the open-air estimates through greater exposure rather than physiology, and our activity proxies are national and not mode-specific. Applied to a warmer mean climate, the same exposure-response implies hundreds of additional US crash deaths per year per degree of warming; because these deaths would continue to be coded as ordinary crashes, the societal heat burden they represent would remain uncounted by heat-mortality surveillance.</w:t>
+        <w:t>Two features of the data are not readily explained by overall driving volume alone and are consistent with a direct heat effect. The excess rose with direct heat exposure: it was small for enclosed, often air-conditioned vehicle occupants but several-fold larger for motorcyclists, pedestrians and cyclists, who are directly exposed and often physically exerting. It was also largest in the hottest hours of the day. Both patterns are consistent with heat degrading psychomotor and cognitive performance. The crash-circumstance strata point the same way: the excess was larger for single-vehicle crashes than for multi-vehicle collisions, persisted on clear days, and was similar whether or not a driver was reported to have been drinking. The Japanese strata, although very imprecise, point the same way: the single-vehicle estimate was again the largest and the vehicle-pedestrian point estimate fell below one, the ordering expected if hot days both degrade vehicle control and reduce pedestrian exposure.These gradients are not proof of mechanism, however: open-air travel is itself weather-sensitive, so more motorcycling, cycling and walking on hotter-than-normal days could inflate the open-air estimates through greater exposure rather than physiology, and our activity proxies are national and not mode-specific. Applied to a warmer mean climate, the same exposure-response implies hundreds of additional US crash deaths per year per degree of warming; because these deaths would continue to be coded as ordinary crashes, the societal heat burden they represent would remain uncounted by heat-mortality surveillance.</w:t>
       </w:r>
     </w:p>
     <w:p>
@@ -3325,7 +3325,7 @@
         <w:spacing w:line="480" w:lineRule="auto" w:after="120"/>
       </w:pPr>
       <w:r>
-        <w:t>Unusually hot days are associated with an acute excess of US traffic-crash deaths that routine crash and heat-mortality surveillance do not capture. Road-safety agencies could treat forecast heat as a crash-risk condition: integrate temperature warnings into crash-prevention messaging, target alerts at motorcyclists, cyclists, pedestrians and outdoor delivery riders, and coordinate with heat-health plans so that warnings reach outdoor workers and commuters. Shared e-scooter, e-bike and bikeshare operators could temporarily reduce or suspend rentals above high-temperature thresholds, shade or relocate docking and charging infrastructure, and add heat warnings to app-based routing. These measures are consistent with a Safe System approach to environmental risk; intervention studies are needed to test whether they reduce crash risk.</w:t>
+        <w:t>Unusually hot days are associated with an acute excess of US traffic-crash deaths that routine crash and heat-mortality surveillance do not capture. Road-safety agencies could treat forecast heat as a crash-risk condition: integrate temperature warnings into crash-prevention messaging, target alerts at motorcyclists, cyclists, pedestrians and outdoor delivery riders, and coordinate with heat-health plans so that warnings reach outdoor workers and commuters. Shared e-scooter, e-bike and bikeshare operators could consider temporary service modifications during extreme heat, shade or relocate docking and charging infrastructure, and add heat warnings to app-based routing. These measures are consistent with a Safe System approach to environmental risk; intervention studies are needed to test whether they reduce crash risk.</w:t>
       </w:r>
     </w:p>
     <w:p>

</xml_diff>